<commit_message>
release: align records-ai with civiccore 0.3.0 (#48)
Co-authored-by: Scott Converse <1474146+scottconverse@users.noreply.github.com>
</commit_message>
<xml_diff>
--- a/docs/CivicRecordsAI-UnifiedSpec-v3.1.docx
+++ b/docs/CivicRecordsAI-UnifiedSpec-v3.1.docx
@@ -260,7 +260,7 @@
           <w:sz w:val="24"/>
           <w:szCs w:val="24"/>
         </w:rPr>
-        <w:t xml:space="preserve"> — Available since v0.1.0; tested through v1.4.0</w:t>
+        <w:t xml:space="preserve"> — Available since v0.1.0; tested through v1.4.1</w:t>
       </w:r>
     </w:p>
     <w:p>
@@ -18127,7 +18127,7 @@
           <w:sz w:val="72"/>
           <w:szCs w:val="72"/>
         </w:rPr>
-        <w:t xml:space="preserve">Appendix A: Migration history (v0.1.0 → v1.4.0)</w:t>
+        <w:t xml:space="preserve">Appendix A: Migration history (v0.1.0 → v1.4.1)</w:t>
       </w:r>
     </w:p>
     <w:p>

</xml_diff>